<commit_message>
Archive the first BFSU Zhihu answer as dual DOCX files.
Convert Mourad Bey's screenshot PDF into an original transcript and a
dimension-annotated copy, then refresh the school-article catalog.

Co-authored-by: 36613453226Wallen <36613453226Wallen@users.noreply.github.com>
</commit_message>
<xml_diff>
--- a/files/就读文章目录/就读文章目录.docx
+++ b/files/就读文章目录/就读文章目录.docx
@@ -29,7 +29,7 @@
           <w:color w:val="5F6368"/>
           <w:sz w:val="16"/>
         </w:rPr>
-        <w:t>登记 0 篇｜待PDF 0 篇｜更新 2026-09-15｜口令：“收录就读文章”</w:t>
+        <w:t>登记 1 篇｜待PDF 0 篇｜更新 2026-09-15 11:39 UTC｜口令：“收录就读文章”</w:t>
       </w:r>
     </w:p>
     <w:tbl>
@@ -185,9 +185,8 @@
       <w:tr>
         <w:tc>
           <w:tcPr>
-            <w:tcW w:type="dxa" w:w="10800"/>
-            <w:gridSpan w:val="6"/>
-            <w:shd w:fill="FFF8E7"/>
+            <w:tcW w:type="dxa" w:w="720"/>
+            <w:vAlign w:val="center"/>
           </w:tcPr>
           <w:p>
             <w:pPr>
@@ -198,10 +197,141 @@
               <w:rPr>
                 <w:rFonts w:ascii="宋体" w:hAnsi="宋体" w:eastAsia="宋体"/>
                 <w:b w:val="0"/>
-                <w:color w:val="7A581A"/>
-                <w:sz w:val="18"/>
+                <w:sz w:val="17"/>
               </w:rPr>
-              <w:t>暂无已收录文章。发送「收录就读文章」并附 PDF 与原文链接。</w:t>
+              <w:t>1</w:t>
+            </w:r>
+          </w:p>
+        </w:tc>
+        <w:tc>
+          <w:tcPr>
+            <w:tcW w:type="dxa" w:w="3384"/>
+            <w:vAlign w:val="center"/>
+          </w:tcPr>
+          <w:p>
+            <w:pPr>
+              <w:spacing w:before="0" w:after="0" w:line="240" w:lineRule="auto"/>
+              <w:jc w:val="left"/>
+            </w:pPr>
+            <w:r>
+              <w:rPr>
+                <w:rFonts w:ascii="宋体" w:hAnsi="宋体" w:eastAsia="宋体"/>
+                <w:b w:val="0"/>
+                <w:sz w:val="17"/>
+              </w:rPr>
+              <w:t>1考上北外啥感觉？外院香、校园土、回乡还是吹.docx</w:t>
+            </w:r>
+          </w:p>
+          <w:p>
+            <w:pPr>
+              <w:spacing w:before="0" w:after="0" w:line="240" w:lineRule="auto"/>
+            </w:pPr>
+            <w:r>
+              <w:rPr>
+                <w:rFonts w:ascii="宋体" w:hAnsi="宋体" w:eastAsia="宋体"/>
+                <w:b w:val="0"/>
+                <w:color w:val="2E74B5"/>
+                <w:sz w:val="15"/>
+              </w:rPr>
+              <w:t>原文：https://www.zhihu.com/question/64391382/answer/1335732679</w:t>
+            </w:r>
+          </w:p>
+          <w:p>
+            <w:pPr>
+              <w:spacing w:before="0" w:after="0" w:line="240" w:lineRule="auto"/>
+            </w:pPr>
+            <w:r>
+              <w:rPr>
+                <w:rFonts w:ascii="宋体" w:hAnsi="宋体" w:eastAsia="宋体"/>
+                <w:b w:val="0"/>
+                <w:color w:val="595959"/>
+                <w:sz w:val="15"/>
+              </w:rPr>
+              <w:t>评注：1考上北外啥感觉？外院香、校园土、回乡还是吹.分维评注.docx</w:t>
+            </w:r>
+          </w:p>
+        </w:tc>
+        <w:tc>
+          <w:tcPr>
+            <w:tcW w:type="dxa" w:w="2088"/>
+            <w:vAlign w:val="center"/>
+          </w:tcPr>
+          <w:p>
+            <w:pPr>
+              <w:spacing w:before="0" w:after="0" w:line="240" w:lineRule="auto"/>
+              <w:jc w:val="left"/>
+            </w:pPr>
+            <w:r>
+              <w:rPr>
+                <w:rFonts w:ascii="宋体" w:hAnsi="宋体" w:eastAsia="宋体"/>
+                <w:b w:val="0"/>
+                <w:sz w:val="17"/>
+              </w:rPr>
+              <w:t>发布：未知（截图只显示编辑时间）</w:t>
+              <w:br/>
+              <w:t>编辑：2020-07-30 11:38（截图页脚）</w:t>
+              <w:br/>
+              <w:t>快照：2026-09-15 11:27 UTC（FireShot 元数据）</w:t>
+            </w:r>
+          </w:p>
+        </w:tc>
+        <w:tc>
+          <w:tcPr>
+            <w:tcW w:type="dxa" w:w="1584"/>
+            <w:vAlign w:val="center"/>
+          </w:tcPr>
+          <w:p>
+            <w:pPr>
+              <w:spacing w:before="0" w:after="0" w:line="240" w:lineRule="auto"/>
+              <w:jc w:val="center"/>
+            </w:pPr>
+            <w:r>
+              <w:rPr>
+                <w:rFonts w:ascii="宋体" w:hAnsi="宋体" w:eastAsia="宋体"/>
+                <w:b w:val="0"/>
+                <w:sz w:val="17"/>
+              </w:rPr>
+              <w:t>北京外国语大学</w:t>
+            </w:r>
+          </w:p>
+        </w:tc>
+        <w:tc>
+          <w:tcPr>
+            <w:tcW w:type="dxa" w:w="1584"/>
+            <w:vAlign w:val="center"/>
+          </w:tcPr>
+          <w:p>
+            <w:pPr>
+              <w:spacing w:before="0" w:after="0" w:line="240" w:lineRule="auto"/>
+              <w:jc w:val="center"/>
+            </w:pPr>
+            <w:r>
+              <w:rPr>
+                <w:rFonts w:ascii="宋体" w:hAnsi="宋体" w:eastAsia="宋体"/>
+                <w:b w:val="0"/>
+                <w:sz w:val="17"/>
+              </w:rPr>
+              <w:t>未写明</w:t>
+            </w:r>
+          </w:p>
+        </w:tc>
+        <w:tc>
+          <w:tcPr>
+            <w:tcW w:type="dxa" w:w="1656"/>
+            <w:vAlign w:val="center"/>
+          </w:tcPr>
+          <w:p>
+            <w:pPr>
+              <w:spacing w:before="0" w:after="0" w:line="240" w:lineRule="auto"/>
+              <w:jc w:val="center"/>
+            </w:pPr>
+            <w:r>
+              <w:rPr>
+                <w:rFonts w:ascii="宋体" w:hAnsi="宋体" w:eastAsia="宋体"/>
+                <w:b w:val="0"/>
+                <w:sz w:val="17"/>
+              </w:rPr>
+              <w:t>已生成</w:t>
             </w:r>
           </w:p>
         </w:tc>

</xml_diff>

<commit_message>
Archive the second BFSU Zhihu answer and suffix article 1 with MouradBey.
Rename the first dual DOCX pair so filenames end with MouradBey, then add
未凋零怪君's Korean-major campus essay as original and annotated copies.

Co-authored-by: 36613453226Wallen <36613453226Wallen@users.noreply.github.com>
</commit_message>
<xml_diff>
--- a/files/就读文章目录/就读文章目录.docx
+++ b/files/就读文章目录/就读文章目录.docx
@@ -29,7 +29,7 @@
           <w:color w:val="5F6368"/>
           <w:sz w:val="16"/>
         </w:rPr>
-        <w:t>登记 1 篇｜待PDF 0 篇｜更新 2026-09-15 11:39 UTC｜口令：“收录就读文章”</w:t>
+        <w:t>登记 2 篇｜待PDF 0 篇｜更新 2026-09-15 11:50 UTC｜口令：“收录就读文章”</w:t>
       </w:r>
     </w:p>
     <w:tbl>
@@ -219,7 +219,7 @@
                 <w:b w:val="0"/>
                 <w:sz w:val="17"/>
               </w:rPr>
-              <w:t>1考上北外啥感觉？外院香、校园土、回乡还是吹.docx</w:t>
+              <w:t>1考上北外啥感觉？外院香、校园土、回乡还是吹MouradBey.docx</w:t>
             </w:r>
           </w:p>
           <w:p>
@@ -247,7 +247,7 @@
                 <w:color w:val="595959"/>
                 <w:sz w:val="15"/>
               </w:rPr>
-              <w:t>评注：1考上北外啥感觉？外院香、校园土、回乡还是吹.分维评注.docx</w:t>
+              <w:t>评注：1考上北外啥感觉？外院香、校园土、回乡还是吹MouradBey.分维评注.docx</w:t>
             </w:r>
           </w:p>
         </w:tc>
@@ -319,6 +319,166 @@
           <w:tcPr>
             <w:tcW w:type="dxa" w:w="1656"/>
             <w:vAlign w:val="center"/>
+          </w:tcPr>
+          <w:p>
+            <w:pPr>
+              <w:spacing w:before="0" w:after="0" w:line="240" w:lineRule="auto"/>
+              <w:jc w:val="center"/>
+            </w:pPr>
+            <w:r>
+              <w:rPr>
+                <w:rFonts w:ascii="宋体" w:hAnsi="宋体" w:eastAsia="宋体"/>
+                <w:b w:val="0"/>
+                <w:sz w:val="17"/>
+              </w:rPr>
+              <w:t>已生成</w:t>
+            </w:r>
+          </w:p>
+        </w:tc>
+      </w:tr>
+      <w:tr>
+        <w:tc>
+          <w:tcPr>
+            <w:tcW w:type="dxa" w:w="720"/>
+            <w:vAlign w:val="center"/>
+            <w:shd w:fill="F6F8FA"/>
+          </w:tcPr>
+          <w:p>
+            <w:pPr>
+              <w:spacing w:before="0" w:after="0" w:line="240" w:lineRule="auto"/>
+              <w:jc w:val="center"/>
+            </w:pPr>
+            <w:r>
+              <w:rPr>
+                <w:rFonts w:ascii="宋体" w:hAnsi="宋体" w:eastAsia="宋体"/>
+                <w:b w:val="0"/>
+                <w:sz w:val="17"/>
+              </w:rPr>
+              <w:t>2</w:t>
+            </w:r>
+          </w:p>
+        </w:tc>
+        <w:tc>
+          <w:tcPr>
+            <w:tcW w:type="dxa" w:w="3384"/>
+            <w:vAlign w:val="center"/>
+            <w:shd w:fill="F6F8FA"/>
+          </w:tcPr>
+          <w:p>
+            <w:pPr>
+              <w:spacing w:before="0" w:after="0" w:line="240" w:lineRule="auto"/>
+              <w:jc w:val="left"/>
+            </w:pPr>
+            <w:r>
+              <w:rPr>
+                <w:rFonts w:ascii="宋体" w:hAnsi="宋体" w:eastAsia="宋体"/>
+                <w:b w:val="0"/>
+                <w:sz w:val="17"/>
+              </w:rPr>
+              <w:t>2北外就读啥体验？可能性抹杀、朝鲜语别报未凋零怪君.docx</w:t>
+            </w:r>
+          </w:p>
+          <w:p>
+            <w:pPr>
+              <w:spacing w:before="0" w:after="0" w:line="240" w:lineRule="auto"/>
+            </w:pPr>
+            <w:r>
+              <w:rPr>
+                <w:rFonts w:ascii="宋体" w:hAnsi="宋体" w:eastAsia="宋体"/>
+                <w:b w:val="0"/>
+                <w:color w:val="2E74B5"/>
+                <w:sz w:val="15"/>
+              </w:rPr>
+              <w:t>原文：https://www.zhihu.com/question/308130958/answer/2048414048543306786</w:t>
+            </w:r>
+          </w:p>
+          <w:p>
+            <w:pPr>
+              <w:spacing w:before="0" w:after="0" w:line="240" w:lineRule="auto"/>
+            </w:pPr>
+            <w:r>
+              <w:rPr>
+                <w:rFonts w:ascii="宋体" w:hAnsi="宋体" w:eastAsia="宋体"/>
+                <w:b w:val="0"/>
+                <w:color w:val="595959"/>
+                <w:sz w:val="15"/>
+              </w:rPr>
+              <w:t>评注：2北外就读啥体验？可能性抹杀、朝鲜语别报未凋零怪君.分维评注.docx</w:t>
+            </w:r>
+          </w:p>
+        </w:tc>
+        <w:tc>
+          <w:tcPr>
+            <w:tcW w:type="dxa" w:w="2088"/>
+            <w:vAlign w:val="center"/>
+            <w:shd w:fill="F6F8FA"/>
+          </w:tcPr>
+          <w:p>
+            <w:pPr>
+              <w:spacing w:before="0" w:after="0" w:line="240" w:lineRule="auto"/>
+              <w:jc w:val="left"/>
+            </w:pPr>
+            <w:r>
+              <w:rPr>
+                <w:rFonts w:ascii="宋体" w:hAnsi="宋体" w:eastAsia="宋体"/>
+                <w:b w:val="0"/>
+                <w:sz w:val="17"/>
+              </w:rPr>
+              <w:t>发布：未知（截图只显示编辑时间）</w:t>
+              <w:br/>
+              <w:t>编辑：2026-09-10 19:43 · 北京（截图页脚；文内另有 2026.9.10更新）</w:t>
+              <w:br/>
+              <w:t>快照：2026-09-15 11:29 UTC（FireShot 元数据）</w:t>
+            </w:r>
+          </w:p>
+        </w:tc>
+        <w:tc>
+          <w:tcPr>
+            <w:tcW w:type="dxa" w:w="1584"/>
+            <w:vAlign w:val="center"/>
+            <w:shd w:fill="F6F8FA"/>
+          </w:tcPr>
+          <w:p>
+            <w:pPr>
+              <w:spacing w:before="0" w:after="0" w:line="240" w:lineRule="auto"/>
+              <w:jc w:val="center"/>
+            </w:pPr>
+            <w:r>
+              <w:rPr>
+                <w:rFonts w:ascii="宋体" w:hAnsi="宋体" w:eastAsia="宋体"/>
+                <w:b w:val="0"/>
+                <w:sz w:val="17"/>
+              </w:rPr>
+              <w:t>北京外国语大学</w:t>
+            </w:r>
+          </w:p>
+        </w:tc>
+        <w:tc>
+          <w:tcPr>
+            <w:tcW w:type="dxa" w:w="1584"/>
+            <w:vAlign w:val="center"/>
+            <w:shd w:fill="F6F8FA"/>
+          </w:tcPr>
+          <w:p>
+            <w:pPr>
+              <w:spacing w:before="0" w:after="0" w:line="240" w:lineRule="auto"/>
+              <w:jc w:val="center"/>
+            </w:pPr>
+            <w:r>
+              <w:rPr>
+                <w:rFonts w:ascii="宋体" w:hAnsi="宋体" w:eastAsia="宋体"/>
+                <w:b w:val="0"/>
+                <w:sz w:val="17"/>
+              </w:rPr>
+              <w:t>亚洲学院朝鲜语</w:t>
+            </w:r>
+          </w:p>
+        </w:tc>
+        <w:tc>
+          <w:tcPr>
+            <w:tcW w:type="dxa" w:w="1656"/>
+            <w:vAlign w:val="center"/>
+            <w:shd w:fill="F6F8FA"/>
           </w:tcPr>
           <w:p>
             <w:pPr>

</xml_diff>

<commit_message>
Archive two BFSU MJC Zhihu answers and file them under 合集.
Add the 冰洁ice screenshot as page 2 of 合2, keep the 知乎直答 as the mjc document, and copy originals (not analyses) into 北外-国际新闻传媒学院.

Co-authored-by: 36613453226Wallen <36613453226Wallen@users.noreply.github.com>
</commit_message>
<xml_diff>
--- a/files/就读文章目录/就读文章目录.docx
+++ b/files/就读文章目录/就读文章目录.docx
@@ -29,7 +29,7 @@
           <w:color w:val="5F6368"/>
           <w:sz w:val="16"/>
         </w:rPr>
-        <w:t>登记 2 篇｜待PDF 0 篇｜更新 2026-09-15 11:50 UTC｜口令：“收录就读文章”</w:t>
+        <w:t>登记 4 篇｜待PDF 0 篇｜更新 2026-09-15 22:45 UTC｜口令：“收录就读文章”</w:t>
       </w:r>
     </w:p>
     <w:tbl>
@@ -496,6 +496,292 @@
           </w:p>
         </w:tc>
       </w:tr>
+      <w:tr>
+        <w:tc>
+          <w:tcPr>
+            <w:tcW w:type="dxa" w:w="720"/>
+            <w:vAlign w:val="center"/>
+          </w:tcPr>
+          <w:p>
+            <w:pPr>
+              <w:spacing w:before="0" w:after="0" w:line="240" w:lineRule="auto"/>
+              <w:jc w:val="center"/>
+            </w:pPr>
+            <w:r>
+              <w:rPr>
+                <w:rFonts w:ascii="宋体" w:hAnsi="宋体" w:eastAsia="宋体"/>
+                <w:b w:val="0"/>
+                <w:sz w:val="17"/>
+              </w:rPr>
+              <w:t>3</w:t>
+            </w:r>
+          </w:p>
+        </w:tc>
+        <w:tc>
+          <w:tcPr>
+            <w:tcW w:type="dxa" w:w="3384"/>
+            <w:vAlign w:val="center"/>
+          </w:tcPr>
+          <w:p>
+            <w:pPr>
+              <w:spacing w:before="0" w:after="0" w:line="240" w:lineRule="auto"/>
+              <w:jc w:val="left"/>
+            </w:pPr>
+            <w:r>
+              <w:rPr>
+                <w:rFonts w:ascii="宋体" w:hAnsi="宋体" w:eastAsia="宋体"/>
+                <w:b w:val="0"/>
+                <w:sz w:val="17"/>
+              </w:rPr>
+              <w:t>3北外中政MJC咋选？国新出名叫北外、走211选中政冰洁ice.docx</w:t>
+            </w:r>
+          </w:p>
+          <w:p>
+            <w:pPr>
+              <w:spacing w:before="0" w:after="0" w:line="240" w:lineRule="auto"/>
+            </w:pPr>
+            <w:r>
+              <w:rPr>
+                <w:rFonts w:ascii="宋体" w:hAnsi="宋体" w:eastAsia="宋体"/>
+                <w:b w:val="0"/>
+                <w:color w:val="595959"/>
+                <w:sz w:val="15"/>
+              </w:rPr>
+              <w:t>评注：3北外中政MJC咋选？国新出名叫北外、走211选中政冰洁ice.分维评注.docx</w:t>
+            </w:r>
+          </w:p>
+        </w:tc>
+        <w:tc>
+          <w:tcPr>
+            <w:tcW w:type="dxa" w:w="2088"/>
+            <w:vAlign w:val="center"/>
+          </w:tcPr>
+          <w:p>
+            <w:pPr>
+              <w:spacing w:before="0" w:after="0" w:line="240" w:lineRule="auto"/>
+              <w:jc w:val="left"/>
+            </w:pPr>
+            <w:r>
+              <w:rPr>
+                <w:rFonts w:ascii="宋体" w:hAnsi="宋体" w:eastAsia="宋体"/>
+                <w:b w:val="0"/>
+                <w:sz w:val="17"/>
+              </w:rPr>
+              <w:t>发布：2019-05-04 09:46（截图「发布于」）</w:t>
+              <w:br/>
+              <w:t>编辑：未知（截图未显示编辑）</w:t>
+              <w:br/>
+              <w:t>快照：用户 2026-09-15 补入的回答截图，无 FireShot 元数据</w:t>
+            </w:r>
+          </w:p>
+        </w:tc>
+        <w:tc>
+          <w:tcPr>
+            <w:tcW w:type="dxa" w:w="1584"/>
+            <w:vAlign w:val="center"/>
+          </w:tcPr>
+          <w:p>
+            <w:pPr>
+              <w:spacing w:before="0" w:after="0" w:line="240" w:lineRule="auto"/>
+              <w:jc w:val="center"/>
+            </w:pPr>
+            <w:r>
+              <w:rPr>
+                <w:rFonts w:ascii="宋体" w:hAnsi="宋体" w:eastAsia="宋体"/>
+                <w:b w:val="0"/>
+                <w:sz w:val="17"/>
+              </w:rPr>
+              <w:t>北京外国语大学；中国政法大学</w:t>
+            </w:r>
+          </w:p>
+        </w:tc>
+        <w:tc>
+          <w:tcPr>
+            <w:tcW w:type="dxa" w:w="1584"/>
+            <w:vAlign w:val="center"/>
+          </w:tcPr>
+          <w:p>
+            <w:pPr>
+              <w:spacing w:before="0" w:after="0" w:line="240" w:lineRule="auto"/>
+              <w:jc w:val="center"/>
+            </w:pPr>
+            <w:r>
+              <w:rPr>
+                <w:rFonts w:ascii="宋体" w:hAnsi="宋体" w:eastAsia="宋体"/>
+                <w:b w:val="0"/>
+                <w:sz w:val="17"/>
+              </w:rPr>
+              <w:t>新闻与传播专业硕士（MJC）</w:t>
+            </w:r>
+          </w:p>
+        </w:tc>
+        <w:tc>
+          <w:tcPr>
+            <w:tcW w:type="dxa" w:w="1656"/>
+            <w:vAlign w:val="center"/>
+          </w:tcPr>
+          <w:p>
+            <w:pPr>
+              <w:spacing w:before="0" w:after="0" w:line="240" w:lineRule="auto"/>
+              <w:jc w:val="center"/>
+            </w:pPr>
+            <w:r>
+              <w:rPr>
+                <w:rFonts w:ascii="宋体" w:hAnsi="宋体" w:eastAsia="宋体"/>
+                <w:b w:val="0"/>
+                <w:sz w:val="17"/>
+              </w:rPr>
+              <w:t>已生成</w:t>
+            </w:r>
+          </w:p>
+        </w:tc>
+      </w:tr>
+      <w:tr>
+        <w:tc>
+          <w:tcPr>
+            <w:tcW w:type="dxa" w:w="720"/>
+            <w:vAlign w:val="center"/>
+            <w:shd w:fill="F6F8FA"/>
+          </w:tcPr>
+          <w:p>
+            <w:pPr>
+              <w:spacing w:before="0" w:after="0" w:line="240" w:lineRule="auto"/>
+              <w:jc w:val="center"/>
+            </w:pPr>
+            <w:r>
+              <w:rPr>
+                <w:rFonts w:ascii="宋体" w:hAnsi="宋体" w:eastAsia="宋体"/>
+                <w:b w:val="0"/>
+                <w:sz w:val="17"/>
+              </w:rPr>
+              <w:t>4</w:t>
+            </w:r>
+          </w:p>
+        </w:tc>
+        <w:tc>
+          <w:tcPr>
+            <w:tcW w:type="dxa" w:w="3384"/>
+            <w:vAlign w:val="center"/>
+            <w:shd w:fill="F6F8FA"/>
+          </w:tcPr>
+          <w:p>
+            <w:pPr>
+              <w:spacing w:before="0" w:after="0" w:line="240" w:lineRule="auto"/>
+              <w:jc w:val="left"/>
+            </w:pPr>
+            <w:r>
+              <w:rPr>
+                <w:rFonts w:ascii="宋体" w:hAnsi="宋体" w:eastAsia="宋体"/>
+                <w:b w:val="0"/>
+                <w:sz w:val="17"/>
+              </w:rPr>
+              <w:t>4上岸北外MJC导师咋选？越早联系越不被动7.3倍的C6H12O6.docx</w:t>
+            </w:r>
+          </w:p>
+          <w:p>
+            <w:pPr>
+              <w:spacing w:before="0" w:after="0" w:line="240" w:lineRule="auto"/>
+            </w:pPr>
+            <w:r>
+              <w:rPr>
+                <w:rFonts w:ascii="宋体" w:hAnsi="宋体" w:eastAsia="宋体"/>
+                <w:b w:val="0"/>
+                <w:color w:val="595959"/>
+                <w:sz w:val="15"/>
+              </w:rPr>
+              <w:t>评注：4上岸北外MJC导师咋选？越早联系越不被动7.3倍的C6H12O6.分维评注.docx</w:t>
+            </w:r>
+          </w:p>
+        </w:tc>
+        <w:tc>
+          <w:tcPr>
+            <w:tcW w:type="dxa" w:w="2088"/>
+            <w:vAlign w:val="center"/>
+            <w:shd w:fill="F6F8FA"/>
+          </w:tcPr>
+          <w:p>
+            <w:pPr>
+              <w:spacing w:before="0" w:after="0" w:line="240" w:lineRule="auto"/>
+              <w:jc w:val="left"/>
+            </w:pPr>
+            <w:r>
+              <w:rPr>
+                <w:rFonts w:ascii="宋体" w:hAnsi="宋体" w:eastAsia="宋体"/>
+                <w:b w:val="0"/>
+                <w:sz w:val="17"/>
+              </w:rPr>
+              <w:t>发布：2020-05-29 10:35（截图「发布于」）</w:t>
+              <w:br/>
+              <w:t>编辑：未知（截图未显示编辑）</w:t>
+              <w:br/>
+              <w:t>快照：2026-09-15 22:20 UTC（FireShot 元数据）</w:t>
+            </w:r>
+          </w:p>
+        </w:tc>
+        <w:tc>
+          <w:tcPr>
+            <w:tcW w:type="dxa" w:w="1584"/>
+            <w:vAlign w:val="center"/>
+            <w:shd w:fill="F6F8FA"/>
+          </w:tcPr>
+          <w:p>
+            <w:pPr>
+              <w:spacing w:before="0" w:after="0" w:line="240" w:lineRule="auto"/>
+              <w:jc w:val="center"/>
+            </w:pPr>
+            <w:r>
+              <w:rPr>
+                <w:rFonts w:ascii="宋体" w:hAnsi="宋体" w:eastAsia="宋体"/>
+                <w:b w:val="0"/>
+                <w:sz w:val="17"/>
+              </w:rPr>
+              <w:t>北京外国语大学</w:t>
+            </w:r>
+          </w:p>
+        </w:tc>
+        <w:tc>
+          <w:tcPr>
+            <w:tcW w:type="dxa" w:w="1584"/>
+            <w:vAlign w:val="center"/>
+            <w:shd w:fill="F6F8FA"/>
+          </w:tcPr>
+          <w:p>
+            <w:pPr>
+              <w:spacing w:before="0" w:after="0" w:line="240" w:lineRule="auto"/>
+              <w:jc w:val="center"/>
+            </w:pPr>
+            <w:r>
+              <w:rPr>
+                <w:rFonts w:ascii="宋体" w:hAnsi="宋体" w:eastAsia="宋体"/>
+                <w:b w:val="0"/>
+                <w:sz w:val="17"/>
+              </w:rPr>
+              <w:t>新闻与传播专业硕士（MJC）</w:t>
+            </w:r>
+          </w:p>
+        </w:tc>
+        <w:tc>
+          <w:tcPr>
+            <w:tcW w:type="dxa" w:w="1656"/>
+            <w:vAlign w:val="center"/>
+            <w:shd w:fill="F6F8FA"/>
+          </w:tcPr>
+          <w:p>
+            <w:pPr>
+              <w:spacing w:before="0" w:after="0" w:line="240" w:lineRule="auto"/>
+              <w:jc w:val="center"/>
+            </w:pPr>
+            <w:r>
+              <w:rPr>
+                <w:rFonts w:ascii="宋体" w:hAnsi="宋体" w:eastAsia="宋体"/>
+                <w:b w:val="0"/>
+                <w:sz w:val="17"/>
+              </w:rPr>
+              <w:t>已生成</w:t>
+            </w:r>
+          </w:p>
+        </w:tc>
+      </w:tr>
     </w:tbl>
     <w:p>
       <w:pPr>

</xml_diff>

<commit_message>
Archive two Whever answers as articles 5 and 6.
Keep the original -Whever1 / -Whever2 tails and only prefix 俄语生本科 and 国关推荐, with the supplied Zhihu URLs.

Co-authored-by: 36613453226Wallen <36613453226Wallen@users.noreply.github.com>
</commit_message>
<xml_diff>
--- a/files/就读文章目录/就读文章目录.docx
+++ b/files/就读文章目录/就读文章目录.docx
@@ -29,7 +29,7 @@
           <w:color w:val="5F6368"/>
           <w:sz w:val="16"/>
         </w:rPr>
-        <w:t>登记 4 篇｜待PDF 0 篇｜更新 2026-09-15 22:45 UTC｜口令：“收录就读文章”</w:t>
+        <w:t>登记 6 篇｜待PDF 0 篇｜更新 2026-09-15 22:58 UTC｜口令：“收录就读文章”</w:t>
       </w:r>
     </w:p>
     <w:tbl>
@@ -782,6 +782,320 @@
           </w:p>
         </w:tc>
       </w:tr>
+      <w:tr>
+        <w:tc>
+          <w:tcPr>
+            <w:tcW w:type="dxa" w:w="720"/>
+            <w:vAlign w:val="center"/>
+          </w:tcPr>
+          <w:p>
+            <w:pPr>
+              <w:spacing w:before="0" w:after="0" w:line="240" w:lineRule="auto"/>
+              <w:jc w:val="center"/>
+            </w:pPr>
+            <w:r>
+              <w:rPr>
+                <w:rFonts w:ascii="宋体" w:hAnsi="宋体" w:eastAsia="宋体"/>
+                <w:b w:val="0"/>
+                <w:sz w:val="17"/>
+              </w:rPr>
+              <w:t>5</w:t>
+            </w:r>
+          </w:p>
+        </w:tc>
+        <w:tc>
+          <w:tcPr>
+            <w:tcW w:type="dxa" w:w="3384"/>
+            <w:vAlign w:val="center"/>
+          </w:tcPr>
+          <w:p>
+            <w:pPr>
+              <w:spacing w:before="0" w:after="0" w:line="240" w:lineRule="auto"/>
+              <w:jc w:val="left"/>
+            </w:pPr>
+            <w:r>
+              <w:rPr>
+                <w:rFonts w:ascii="宋体" w:hAnsi="宋体" w:eastAsia="宋体"/>
+                <w:b w:val="0"/>
+                <w:sz w:val="17"/>
+              </w:rPr>
+              <w:t>5俄语生本科-Whever1.docx</w:t>
+            </w:r>
+          </w:p>
+          <w:p>
+            <w:pPr>
+              <w:spacing w:before="0" w:after="0" w:line="240" w:lineRule="auto"/>
+            </w:pPr>
+            <w:r>
+              <w:rPr>
+                <w:rFonts w:ascii="宋体" w:hAnsi="宋体" w:eastAsia="宋体"/>
+                <w:b w:val="0"/>
+                <w:color w:val="2E74B5"/>
+                <w:sz w:val="15"/>
+              </w:rPr>
+              <w:t>原文：https://www.zhihu.com/question/64391382/answer/3331909814</w:t>
+            </w:r>
+          </w:p>
+          <w:p>
+            <w:pPr>
+              <w:spacing w:before="0" w:after="0" w:line="240" w:lineRule="auto"/>
+            </w:pPr>
+            <w:r>
+              <w:rPr>
+                <w:rFonts w:ascii="宋体" w:hAnsi="宋体" w:eastAsia="宋体"/>
+                <w:b w:val="0"/>
+                <w:color w:val="595959"/>
+                <w:sz w:val="15"/>
+              </w:rPr>
+              <w:t>评注：5俄语生本科-Whever1.分维评注.docx</w:t>
+            </w:r>
+          </w:p>
+        </w:tc>
+        <w:tc>
+          <w:tcPr>
+            <w:tcW w:type="dxa" w:w="2088"/>
+            <w:vAlign w:val="center"/>
+          </w:tcPr>
+          <w:p>
+            <w:pPr>
+              <w:spacing w:before="0" w:after="0" w:line="240" w:lineRule="auto"/>
+              <w:jc w:val="left"/>
+            </w:pPr>
+            <w:r>
+              <w:rPr>
+                <w:rFonts w:ascii="宋体" w:hAnsi="宋体" w:eastAsia="宋体"/>
+                <w:b w:val="0"/>
+                <w:sz w:val="17"/>
+              </w:rPr>
+              <w:t>发布：2023-12-20 08:41（截图「发布于」）</w:t>
+              <w:br/>
+              <w:t>编辑：未知（截图未显示编辑）</w:t>
+              <w:br/>
+              <w:t>快照：2026-09-15 22:49 UTC（FireShot 元数据）</w:t>
+            </w:r>
+          </w:p>
+        </w:tc>
+        <w:tc>
+          <w:tcPr>
+            <w:tcW w:type="dxa" w:w="1584"/>
+            <w:vAlign w:val="center"/>
+          </w:tcPr>
+          <w:p>
+            <w:pPr>
+              <w:spacing w:before="0" w:after="0" w:line="240" w:lineRule="auto"/>
+              <w:jc w:val="center"/>
+            </w:pPr>
+            <w:r>
+              <w:rPr>
+                <w:rFonts w:ascii="宋体" w:hAnsi="宋体" w:eastAsia="宋体"/>
+                <w:b w:val="0"/>
+                <w:sz w:val="17"/>
+              </w:rPr>
+              <w:t>北京外国语大学</w:t>
+            </w:r>
+          </w:p>
+        </w:tc>
+        <w:tc>
+          <w:tcPr>
+            <w:tcW w:type="dxa" w:w="1584"/>
+            <w:vAlign w:val="center"/>
+          </w:tcPr>
+          <w:p>
+            <w:pPr>
+              <w:spacing w:before="0" w:after="0" w:line="240" w:lineRule="auto"/>
+              <w:jc w:val="center"/>
+            </w:pPr>
+            <w:r>
+              <w:rPr>
+                <w:rFonts w:ascii="宋体" w:hAnsi="宋体" w:eastAsia="宋体"/>
+                <w:b w:val="0"/>
+                <w:sz w:val="17"/>
+              </w:rPr>
+              <w:t>俄语（本科）</w:t>
+            </w:r>
+          </w:p>
+        </w:tc>
+        <w:tc>
+          <w:tcPr>
+            <w:tcW w:type="dxa" w:w="1656"/>
+            <w:vAlign w:val="center"/>
+          </w:tcPr>
+          <w:p>
+            <w:pPr>
+              <w:spacing w:before="0" w:after="0" w:line="240" w:lineRule="auto"/>
+              <w:jc w:val="center"/>
+            </w:pPr>
+            <w:r>
+              <w:rPr>
+                <w:rFonts w:ascii="宋体" w:hAnsi="宋体" w:eastAsia="宋体"/>
+                <w:b w:val="0"/>
+                <w:sz w:val="17"/>
+              </w:rPr>
+              <w:t>已生成</w:t>
+            </w:r>
+          </w:p>
+        </w:tc>
+      </w:tr>
+      <w:tr>
+        <w:tc>
+          <w:tcPr>
+            <w:tcW w:type="dxa" w:w="720"/>
+            <w:vAlign w:val="center"/>
+            <w:shd w:fill="F6F8FA"/>
+          </w:tcPr>
+          <w:p>
+            <w:pPr>
+              <w:spacing w:before="0" w:after="0" w:line="240" w:lineRule="auto"/>
+              <w:jc w:val="center"/>
+            </w:pPr>
+            <w:r>
+              <w:rPr>
+                <w:rFonts w:ascii="宋体" w:hAnsi="宋体" w:eastAsia="宋体"/>
+                <w:b w:val="0"/>
+                <w:sz w:val="17"/>
+              </w:rPr>
+              <w:t>6</w:t>
+            </w:r>
+          </w:p>
+        </w:tc>
+        <w:tc>
+          <w:tcPr>
+            <w:tcW w:type="dxa" w:w="3384"/>
+            <w:vAlign w:val="center"/>
+            <w:shd w:fill="F6F8FA"/>
+          </w:tcPr>
+          <w:p>
+            <w:pPr>
+              <w:spacing w:before="0" w:after="0" w:line="240" w:lineRule="auto"/>
+              <w:jc w:val="left"/>
+            </w:pPr>
+            <w:r>
+              <w:rPr>
+                <w:rFonts w:ascii="宋体" w:hAnsi="宋体" w:eastAsia="宋体"/>
+                <w:b w:val="0"/>
+                <w:sz w:val="17"/>
+              </w:rPr>
+              <w:t>6国关推荐-Whever2.docx</w:t>
+            </w:r>
+          </w:p>
+          <w:p>
+            <w:pPr>
+              <w:spacing w:before="0" w:after="0" w:line="240" w:lineRule="auto"/>
+            </w:pPr>
+            <w:r>
+              <w:rPr>
+                <w:rFonts w:ascii="宋体" w:hAnsi="宋体" w:eastAsia="宋体"/>
+                <w:b w:val="0"/>
+                <w:color w:val="2E74B5"/>
+                <w:sz w:val="15"/>
+              </w:rPr>
+              <w:t>原文：https://www.zhihu.com/question/597450083/answer/3000551110</w:t>
+            </w:r>
+          </w:p>
+          <w:p>
+            <w:pPr>
+              <w:spacing w:before="0" w:after="0" w:line="240" w:lineRule="auto"/>
+            </w:pPr>
+            <w:r>
+              <w:rPr>
+                <w:rFonts w:ascii="宋体" w:hAnsi="宋体" w:eastAsia="宋体"/>
+                <w:b w:val="0"/>
+                <w:color w:val="595959"/>
+                <w:sz w:val="15"/>
+              </w:rPr>
+              <w:t>评注：6国关推荐-Whever2.分维评注.docx</w:t>
+            </w:r>
+          </w:p>
+        </w:tc>
+        <w:tc>
+          <w:tcPr>
+            <w:tcW w:type="dxa" w:w="2088"/>
+            <w:vAlign w:val="center"/>
+            <w:shd w:fill="F6F8FA"/>
+          </w:tcPr>
+          <w:p>
+            <w:pPr>
+              <w:spacing w:before="0" w:after="0" w:line="240" w:lineRule="auto"/>
+              <w:jc w:val="left"/>
+            </w:pPr>
+            <w:r>
+              <w:rPr>
+                <w:rFonts w:ascii="宋体" w:hAnsi="宋体" w:eastAsia="宋体"/>
+                <w:b w:val="0"/>
+                <w:sz w:val="17"/>
+              </w:rPr>
+              <w:t>发布：2023-04-25 19:08（截图「发布于」）</w:t>
+              <w:br/>
+              <w:t>编辑：未知（截图未显示编辑）</w:t>
+              <w:br/>
+              <w:t>快照：2026-09-15 22:50 UTC（FireShot 元数据）</w:t>
+            </w:r>
+          </w:p>
+        </w:tc>
+        <w:tc>
+          <w:tcPr>
+            <w:tcW w:type="dxa" w:w="1584"/>
+            <w:vAlign w:val="center"/>
+            <w:shd w:fill="F6F8FA"/>
+          </w:tcPr>
+          <w:p>
+            <w:pPr>
+              <w:spacing w:before="0" w:after="0" w:line="240" w:lineRule="auto"/>
+              <w:jc w:val="center"/>
+            </w:pPr>
+            <w:r>
+              <w:rPr>
+                <w:rFonts w:ascii="宋体" w:hAnsi="宋体" w:eastAsia="宋体"/>
+                <w:b w:val="0"/>
+                <w:sz w:val="17"/>
+              </w:rPr>
+              <w:t>北京外国语大学</w:t>
+            </w:r>
+          </w:p>
+        </w:tc>
+        <w:tc>
+          <w:tcPr>
+            <w:tcW w:type="dxa" w:w="1584"/>
+            <w:vAlign w:val="center"/>
+            <w:shd w:fill="F6F8FA"/>
+          </w:tcPr>
+          <w:p>
+            <w:pPr>
+              <w:spacing w:before="0" w:after="0" w:line="240" w:lineRule="auto"/>
+              <w:jc w:val="center"/>
+            </w:pPr>
+            <w:r>
+              <w:rPr>
+                <w:rFonts w:ascii="宋体" w:hAnsi="宋体" w:eastAsia="宋体"/>
+                <w:b w:val="0"/>
+                <w:sz w:val="17"/>
+              </w:rPr>
+              <w:t>俄语；回答里对比汉教、推荐国关</w:t>
+            </w:r>
+          </w:p>
+        </w:tc>
+        <w:tc>
+          <w:tcPr>
+            <w:tcW w:type="dxa" w:w="1656"/>
+            <w:vAlign w:val="center"/>
+            <w:shd w:fill="F6F8FA"/>
+          </w:tcPr>
+          <w:p>
+            <w:pPr>
+              <w:spacing w:before="0" w:after="0" w:line="240" w:lineRule="auto"/>
+              <w:jc w:val="center"/>
+            </w:pPr>
+            <w:r>
+              <w:rPr>
+                <w:rFonts w:ascii="宋体" w:hAnsi="宋体" w:eastAsia="宋体"/>
+                <w:b w:val="0"/>
+                <w:sz w:val="17"/>
+              </w:rPr>
+              <w:t>已生成</w:t>
+            </w:r>
+          </w:p>
+        </w:tc>
+      </w:tr>
     </w:tbl>
     <w:p>
       <w:pPr>

</xml_diff>

<commit_message>
Archive Zhihu answer 7 and open a five-college forum file.
转写成就你的梦想答「考上北外是什么感觉」，并按截图红框五个学院收集可溯源的本科/研究生部评论取样，附粗评分说明。

Co-authored-by: 36613453226Wallen <36613453226Wallen@users.noreply.github.com>
</commit_message>
<xml_diff>
--- a/files/就读文章目录/就读文章目录.docx
+++ b/files/就读文章目录/就读文章目录.docx
@@ -29,7 +29,7 @@
           <w:color w:val="5F6368"/>
           <w:sz w:val="16"/>
         </w:rPr>
-        <w:t>登记 6 篇｜待PDF 0 篇｜更新 2026-09-15 22:58 UTC｜口令：“收录就读文章”</w:t>
+        <w:t>登记 7 篇｜待PDF 0 篇｜更新 2026-09-16 02:05 UTC｜口令：“收录就读文章”</w:t>
       </w:r>
     </w:p>
     <w:tbl>
@@ -1096,6 +1096,146 @@
           </w:p>
         </w:tc>
       </w:tr>
+      <w:tr>
+        <w:tc>
+          <w:tcPr>
+            <w:tcW w:type="dxa" w:w="720"/>
+            <w:vAlign w:val="center"/>
+          </w:tcPr>
+          <w:p>
+            <w:pPr>
+              <w:spacing w:before="0" w:after="0" w:line="240" w:lineRule="auto"/>
+              <w:jc w:val="center"/>
+            </w:pPr>
+            <w:r>
+              <w:rPr>
+                <w:rFonts w:ascii="宋体" w:hAnsi="宋体" w:eastAsia="宋体"/>
+                <w:b w:val="0"/>
+                <w:sz w:val="17"/>
+              </w:rPr>
+              <w:t>7</w:t>
+            </w:r>
+          </w:p>
+        </w:tc>
+        <w:tc>
+          <w:tcPr>
+            <w:tcW w:type="dxa" w:w="3384"/>
+            <w:vAlign w:val="center"/>
+          </w:tcPr>
+          <w:p>
+            <w:pPr>
+              <w:spacing w:before="0" w:after="0" w:line="240" w:lineRule="auto"/>
+              <w:jc w:val="left"/>
+            </w:pPr>
+            <w:r>
+              <w:rPr>
+                <w:rFonts w:ascii="宋体" w:hAnsi="宋体" w:eastAsia="宋体"/>
+                <w:b w:val="0"/>
+                <w:sz w:val="17"/>
+              </w:rPr>
+              <w:t>7考上北外啥感觉？英语金饭碗、外事数字别神话成就你的梦想.docx</w:t>
+            </w:r>
+          </w:p>
+          <w:p>
+            <w:pPr>
+              <w:spacing w:before="0" w:after="0" w:line="240" w:lineRule="auto"/>
+            </w:pPr>
+            <w:r>
+              <w:rPr>
+                <w:rFonts w:ascii="宋体" w:hAnsi="宋体" w:eastAsia="宋体"/>
+                <w:b w:val="0"/>
+                <w:color w:val="595959"/>
+                <w:sz w:val="15"/>
+              </w:rPr>
+              <w:t>评注：7考上北外啥感觉？英语金饭碗、外事数字别神话成就你的梦想.分维评注.docx</w:t>
+            </w:r>
+          </w:p>
+        </w:tc>
+        <w:tc>
+          <w:tcPr>
+            <w:tcW w:type="dxa" w:w="2088"/>
+            <w:vAlign w:val="center"/>
+          </w:tcPr>
+          <w:p>
+            <w:pPr>
+              <w:spacing w:before="0" w:after="0" w:line="240" w:lineRule="auto"/>
+              <w:jc w:val="left"/>
+            </w:pPr>
+            <w:r>
+              <w:rPr>
+                <w:rFonts w:ascii="宋体" w:hAnsi="宋体" w:eastAsia="宋体"/>
+                <w:b w:val="0"/>
+                <w:sz w:val="17"/>
+              </w:rPr>
+              <w:t>发布：2026-01-28 08:38 · 湖北（截图「发布于」）</w:t>
+              <w:br/>
+              <w:t>编辑：未知（截图未另标「编辑于」）</w:t>
+              <w:br/>
+              <w:t>快照：2026-09-16 01:45 UTC（FireShot 元数据）</w:t>
+            </w:r>
+          </w:p>
+        </w:tc>
+        <w:tc>
+          <w:tcPr>
+            <w:tcW w:type="dxa" w:w="1584"/>
+            <w:vAlign w:val="center"/>
+          </w:tcPr>
+          <w:p>
+            <w:pPr>
+              <w:spacing w:before="0" w:after="0" w:line="240" w:lineRule="auto"/>
+              <w:jc w:val="center"/>
+            </w:pPr>
+            <w:r>
+              <w:rPr>
+                <w:rFonts w:ascii="宋体" w:hAnsi="宋体" w:eastAsia="宋体"/>
+                <w:b w:val="0"/>
+                <w:sz w:val="17"/>
+              </w:rPr>
+              <w:t>北京外国语大学</w:t>
+            </w:r>
+          </w:p>
+        </w:tc>
+        <w:tc>
+          <w:tcPr>
+            <w:tcW w:type="dxa" w:w="1584"/>
+            <w:vAlign w:val="center"/>
+          </w:tcPr>
+          <w:p>
+            <w:pPr>
+              <w:spacing w:before="0" w:after="0" w:line="240" w:lineRule="auto"/>
+              <w:jc w:val="center"/>
+            </w:pPr>
+            <w:r>
+              <w:rPr>
+                <w:rFonts w:ascii="宋体" w:hAnsi="宋体" w:eastAsia="宋体"/>
+                <w:b w:val="0"/>
+                <w:sz w:val="17"/>
+              </w:rPr>
+              <w:t>英语（推销口径，作者未写自己的年级专业）</w:t>
+            </w:r>
+          </w:p>
+        </w:tc>
+        <w:tc>
+          <w:tcPr>
+            <w:tcW w:type="dxa" w:w="1656"/>
+            <w:vAlign w:val="center"/>
+          </w:tcPr>
+          <w:p>
+            <w:pPr>
+              <w:spacing w:before="0" w:after="0" w:line="240" w:lineRule="auto"/>
+              <w:jc w:val="center"/>
+            </w:pPr>
+            <w:r>
+              <w:rPr>
+                <w:rFonts w:ascii="宋体" w:hAnsi="宋体" w:eastAsia="宋体"/>
+                <w:b w:val="0"/>
+                <w:sz w:val="17"/>
+              </w:rPr>
+              <w:t>已生成</w:t>
+            </w:r>
+          </w:p>
+        </w:tc>
+      </w:tr>
     </w:tbl>
     <w:p>
       <w:pPr>

</xml_diff>